<commit_message>
Predicables revisions: second intentions, swap test, property as power; revise property/accident/difference items; add supposition note; update Unit 0/1 DI scripts
</commit_message>
<xml_diff>
--- a/Direct Instruction Scripts/Unit 1 Part B - Lessons 8-11.docx
+++ b/Direct Instruction Scripts/Unit 1 Part B - Lessons 8-11.docx
@@ -3171,17 +3171,7 @@
           <w:sz w:val="24"/>
           <w:szCs w:val="24"/>
         </w:rPr>
-        <w:t xml:space="preserve"> the animals. Name an animal you did not hear.</w:t>
-      </w:r>
-      <w:r>
-        <w:rPr>
-          <w:rFonts w:ascii="Calibri" w:cs="Calibri" w:eastAsia="Calibri" w:hAnsi="Calibri"/>
-          <w:i/>
-          <w:iCs/>
-          <w:sz w:val="24"/>
-          <w:szCs w:val="24"/>
-        </w:rPr>
-        <w:t xml:space="preserve"> → </w:t>
+        <w:t xml:space="preserve"> the animals. Name an animal you did not hear. → </w:t>
       </w:r>
       <w:r>
         <w:rPr>
@@ -3199,17 +3189,7 @@
           <w:sz w:val="24"/>
           <w:szCs w:val="24"/>
         </w:rPr>
-        <w:t xml:space="preserve"> </w:t>
-      </w:r>
-      <w:r>
-        <w:rPr>
-          <w:rFonts w:ascii="Calibri" w:cs="Calibri" w:eastAsia="Calibri" w:hAnsi="Calibri"/>
-          <w:i/>
-          <w:iCs/>
-          <w:sz w:val="24"/>
-          <w:szCs w:val="24"/>
-        </w:rPr>
-        <w:t xml:space="preserve">Then somebody was left out.</w:t>
+        <w:t xml:space="preserve"> Then somebody was left out.</w:t>
       </w:r>
       <w:r>
         <w:rPr>
@@ -4420,17 +4400,7 @@
           <w:sz w:val="24"/>
           <w:szCs w:val="24"/>
         </w:rPr>
-        <w:t xml:space="preserve"> of body?</w:t>
-      </w:r>
-      <w:r>
-        <w:rPr>
-          <w:rFonts w:ascii="Calibri" w:cs="Calibri" w:eastAsia="Calibri" w:hAnsi="Calibri"/>
-          <w:i/>
-          <w:iCs/>
-          <w:sz w:val="24"/>
-          <w:szCs w:val="24"/>
-        </w:rPr>
-        <w:t xml:space="preserve"> → </w:t>
+        <w:t xml:space="preserve"> of body? → </w:t>
       </w:r>
       <w:r>
         <w:rPr>
@@ -5198,25 +5168,25 @@
           <w:sz w:val="24"/>
           <w:szCs w:val="24"/>
         </w:rPr>
-        <w:t xml:space="preserve">Which predicable? A square has four corners.</w:t>
-      </w:r>
-      <w:r>
-        <w:rPr>
-          <w:rFonts w:ascii="Calibri" w:cs="Calibri" w:eastAsia="Calibri" w:hAnsi="Calibri"/>
-          <w:sz w:val="24"/>
-          <w:szCs w:val="24"/>
-        </w:rPr>
-        <w:t xml:space="preserve"> → </w:t>
-      </w:r>
-      <w:r>
-        <w:rPr>
-          <w:rFonts w:ascii="Calibri" w:cs="Calibri" w:eastAsia="Calibri" w:hAnsi="Calibri"/>
-          <w:i/>
-          <w:iCs/>
-          <w:sz w:val="24"/>
-          <w:szCs w:val="24"/>
-        </w:rPr>
-        <w:t xml:space="preserve">Property.</w:t>
+        <w:t>Which predicable? Socrates can learn to read. → Property.</w:t>
+      </w:r>
+      <w:r>
+        <w:rPr>
+          <w:rFonts w:ascii="Calibri" w:cs="Calibri" w:eastAsia="Calibri" w:hAnsi="Calibri"/>
+          <w:sz w:val="24"/>
+          <w:szCs w:val="24"/>
+        </w:rPr>
+        <w:t/>
+      </w:r>
+      <w:r>
+        <w:rPr>
+          <w:rFonts w:ascii="Calibri" w:cs="Calibri" w:eastAsia="Calibri" w:hAnsi="Calibri"/>
+          <w:i/>
+          <w:iCs/>
+          <w:sz w:val="24"/>
+          <w:szCs w:val="24"/>
+        </w:rPr>
+        <w:t/>
       </w:r>
       <w:r>
         <w:rPr>
@@ -7515,7 +7485,7 @@
           <w:sz w:val="24"/>
           <w:szCs w:val="24"/>
         </w:rPr>
-        <w:t xml:space="preserve">PROPERTY — not what makes the thing what it is, but every one has it, always</w:t>
+        <w:t>PROPERTY — not what makes the thing what it is, but every one has it, always, and nothing else does</w:t>
       </w:r>
     </w:p>
     <w:p>
@@ -8696,17 +8666,7 @@
           <w:sz w:val="24"/>
           <w:szCs w:val="24"/>
         </w:rPr>
-        <w:t xml:space="preserve"> one. Watch. A chair is furniture for one person. Is a chair furniture?</w:t>
-      </w:r>
-      <w:r>
-        <w:rPr>
-          <w:rFonts w:ascii="Calibri" w:cs="Calibri" w:eastAsia="Calibri" w:hAnsi="Calibri"/>
-          <w:i/>
-          <w:iCs/>
-          <w:sz w:val="24"/>
-          <w:szCs w:val="24"/>
-        </w:rPr>
-        <w:t xml:space="preserve"> (pause, signal) → </w:t>
+        <w:t xml:space="preserve"> one. Watch. A chair is furniture for one person. Is a chair furniture? (pause, signal) → </w:t>
       </w:r>
       <w:r>
         <w:rPr>
@@ -8724,37 +8684,7 @@
           <w:sz w:val="24"/>
           <w:szCs w:val="24"/>
         </w:rPr>
-        <w:t xml:space="preserve"> </w:t>
-      </w:r>
-      <w:r>
-        <w:rPr>
-          <w:rFonts w:ascii="Calibri" w:cs="Calibri" w:eastAsia="Calibri" w:hAnsi="Calibri"/>
-          <w:i/>
-          <w:iCs/>
-          <w:sz w:val="24"/>
-          <w:szCs w:val="24"/>
-        </w:rPr>
-        <w:t xml:space="preserve">But that is a long way up. Look what gets in — a table for one person, a bed for one person. Come down to the nearest kind above chair.</w:t>
-      </w:r>
-      <w:r>
-        <w:rPr>
-          <w:rFonts w:ascii="Calibri" w:cs="Calibri" w:eastAsia="Calibri" w:hAnsi="Calibri"/>
-          <w:i/>
-          <w:iCs/>
-          <w:sz w:val="24"/>
-          <w:szCs w:val="24"/>
-        </w:rPr>
-        <w:t xml:space="preserve"> (Point to the tree you are about to draw.) </w:t>
-      </w:r>
-      <w:r>
-        <w:rPr>
-          <w:rFonts w:ascii="Calibri" w:cs="Calibri" w:eastAsia="Calibri" w:hAnsi="Calibri"/>
-          <w:i/>
-          <w:iCs/>
-          <w:sz w:val="24"/>
-          <w:szCs w:val="24"/>
-        </w:rPr>
-        <w:t xml:space="preserve">A seat. A chair is a seat for one person. Now nothing gets in.</w:t>
+        <w:t xml:space="preserve"> But that is a long way up. Look what gets in — a table for one person, a bed for one person. Come down to the nearest kind above chair. (Point to the tree you are about to draw.) A seat. A chair is a seat for one person. Now nothing gets in.</w:t>
       </w:r>
       <w:r>
         <w:rPr>
@@ -11794,127 +11724,127 @@
           <w:sz w:val="24"/>
           <w:szCs w:val="24"/>
         </w:rPr>
-        <w:t xml:space="preserve">Which predicable? A knife can go dull.</w:t>
-      </w:r>
-      <w:r>
-        <w:rPr>
-          <w:rFonts w:ascii="Calibri" w:cs="Calibri" w:eastAsia="Calibri" w:hAnsi="Calibri"/>
-          <w:sz w:val="24"/>
-          <w:szCs w:val="24"/>
-        </w:rPr>
-        <w:t xml:space="preserve"> (pause, signal) → </w:t>
-      </w:r>
-      <w:r>
-        <w:rPr>
-          <w:rFonts w:ascii="Calibri" w:cs="Calibri" w:eastAsia="Calibri" w:hAnsi="Calibri"/>
-          <w:i/>
-          <w:iCs/>
-          <w:sz w:val="24"/>
-          <w:szCs w:val="24"/>
-        </w:rPr>
-        <w:t xml:space="preserve">Property.</w:t>
-      </w:r>
-    </w:p>
-    <w:p>
-      <w:pPr>
-        <w:spacing w:after="120" w:line="276"/>
-      </w:pPr>
-      <w:r>
-        <w:rPr>
-          <w:rFonts w:ascii="Calibri" w:cs="Calibri" w:eastAsia="Calibri" w:hAnsi="Calibri"/>
-          <w:b/>
-          <w:bCs/>
-          <w:sz w:val="24"/>
-          <w:szCs w:val="24"/>
-        </w:rPr>
-        <w:t>Judge it — good, too wide, too narrow, circular, or dark? A knife is a tool that can go dull.</w:t>
-      </w:r>
-      <w:r>
-        <w:rPr>
-          <w:rFonts w:ascii="Calibri" w:cs="Calibri" w:eastAsia="Calibri" w:hAnsi="Calibri"/>
-          <w:sz w:val="24"/>
-          <w:szCs w:val="24"/>
-        </w:rPr>
-        <w:t xml:space="preserve"> (pause, signal) → </w:t>
-      </w:r>
-      <w:r>
-        <w:rPr>
-          <w:rFonts w:ascii="Calibri" w:cs="Calibri" w:eastAsia="Calibri" w:hAnsi="Calibri"/>
-          <w:i/>
-          <w:iCs/>
-          <w:sz w:val="24"/>
-          <w:szCs w:val="24"/>
-        </w:rPr>
-        <w:t xml:space="preserve">Too wide.</w:t>
-      </w:r>
-      <w:r>
-        <w:rPr>
-          <w:rFonts w:ascii="Calibri" w:cs="Calibri" w:eastAsia="Calibri" w:hAnsi="Calibri"/>
-          <w:sz w:val="24"/>
-          <w:szCs w:val="24"/>
-        </w:rPr>
-        <w:t xml:space="preserve"> </w:t>
-      </w:r>
-      <w:r>
-        <w:rPr>
-          <w:rFonts w:ascii="Calibri" w:cs="Calibri" w:eastAsia="Calibri" w:hAnsi="Calibri"/>
-          <w:b/>
-          <w:bCs/>
-          <w:sz w:val="24"/>
-          <w:szCs w:val="24"/>
-        </w:rPr>
-        <w:t xml:space="preserve">Name the counterexample.</w:t>
-      </w:r>
-      <w:r>
-        <w:rPr>
-          <w:rFonts w:ascii="Calibri" w:cs="Calibri" w:eastAsia="Calibri" w:hAnsi="Calibri"/>
-          <w:sz w:val="24"/>
-          <w:szCs w:val="24"/>
-        </w:rPr>
-        <w:t xml:space="preserve"> → </w:t>
-      </w:r>
-      <w:r>
-        <w:rPr>
-          <w:rFonts w:ascii="Calibri" w:cs="Calibri" w:eastAsia="Calibri" w:hAnsi="Calibri"/>
-          <w:i/>
-          <w:iCs/>
-          <w:sz w:val="24"/>
-          <w:szCs w:val="24"/>
-        </w:rPr>
-        <w:t xml:space="preserve">A saw. / A hammer.</w:t>
-      </w:r>
-    </w:p>
-    <w:p>
-      <w:pPr>
-        <w:spacing w:after="120" w:line="276"/>
-      </w:pPr>
-      <w:r>
-        <w:rPr>
-          <w:rFonts w:ascii="Calibri" w:cs="Calibri" w:eastAsia="Calibri" w:hAnsi="Calibri"/>
-          <w:b/>
-          <w:bCs/>
-          <w:sz w:val="24"/>
-          <w:szCs w:val="24"/>
-        </w:rPr>
-        <w:t xml:space="preserve">(12). That one used a property instead of the difference. What is the difference of a knife?</w:t>
-      </w:r>
-      <w:r>
-        <w:rPr>
-          <w:rFonts w:ascii="Calibri" w:cs="Calibri" w:eastAsia="Calibri" w:hAnsi="Calibri"/>
-          <w:sz w:val="24"/>
-          <w:szCs w:val="24"/>
-        </w:rPr>
-        <w:t xml:space="preserve"> → </w:t>
-      </w:r>
-      <w:r>
-        <w:rPr>
-          <w:rFonts w:ascii="Calibri" w:cs="Calibri" w:eastAsia="Calibri" w:hAnsi="Calibri"/>
-          <w:i/>
-          <w:iCs/>
-          <w:sz w:val="24"/>
-          <w:szCs w:val="24"/>
-        </w:rPr>
-        <w:t xml:space="preserve">Having a blade for cutting.</w:t>
+        <w:t>Which predicable? A triangle has three corners. (pause, signal) → Property.</w:t>
+      </w:r>
+      <w:r>
+        <w:rPr>
+          <w:rFonts w:ascii="Calibri" w:cs="Calibri" w:eastAsia="Calibri" w:hAnsi="Calibri"/>
+          <w:sz w:val="24"/>
+          <w:szCs w:val="24"/>
+        </w:rPr>
+        <w:t/>
+      </w:r>
+      <w:r>
+        <w:rPr>
+          <w:rFonts w:ascii="Calibri" w:cs="Calibri" w:eastAsia="Calibri" w:hAnsi="Calibri"/>
+          <w:i/>
+          <w:iCs/>
+          <w:sz w:val="24"/>
+          <w:szCs w:val="24"/>
+        </w:rPr>
+        <w:t/>
+      </w:r>
+    </w:p>
+    <w:p>
+      <w:pPr>
+        <w:spacing w:after="120" w:line="276"/>
+      </w:pPr>
+      <w:r>
+        <w:rPr>
+          <w:rFonts w:ascii="Calibri" w:cs="Calibri" w:eastAsia="Calibri" w:hAnsi="Calibri"/>
+          <w:b/>
+          <w:bCs/>
+          <w:sz w:val="24"/>
+          <w:szCs w:val="24"/>
+        </w:rPr>
+        <w:t>Judge it — good, too wide, too narrow, circular, or dark? A triangle is a shape with three corners. (pause, signal) → Good, on the two rules.</w:t>
+      </w:r>
+      <w:r>
+        <w:rPr>
+          <w:rFonts w:ascii="Calibri" w:cs="Calibri" w:eastAsia="Calibri" w:hAnsi="Calibri"/>
+          <w:sz w:val="24"/>
+          <w:szCs w:val="24"/>
+        </w:rPr>
+        <w:t/>
+      </w:r>
+      <w:r>
+        <w:rPr>
+          <w:rFonts w:ascii="Calibri" w:cs="Calibri" w:eastAsia="Calibri" w:hAnsi="Calibri"/>
+          <w:i/>
+          <w:iCs/>
+          <w:sz w:val="24"/>
+          <w:szCs w:val="24"/>
+        </w:rPr>
+        <w:t/>
+      </w:r>
+      <w:r>
+        <w:rPr>
+          <w:rFonts w:ascii="Calibri" w:cs="Calibri" w:eastAsia="Calibri" w:hAnsi="Calibri"/>
+          <w:sz w:val="24"/>
+          <w:szCs w:val="24"/>
+        </w:rPr>
+        <w:t/>
+      </w:r>
+      <w:r>
+        <w:rPr>
+          <w:rFonts w:ascii="Calibri" w:cs="Calibri" w:eastAsia="Calibri" w:hAnsi="Calibri"/>
+          <w:b/>
+          <w:bCs/>
+          <w:sz w:val="24"/>
+          <w:szCs w:val="24"/>
+        </w:rPr>
+        <w:t/>
+      </w:r>
+      <w:r>
+        <w:rPr>
+          <w:rFonts w:ascii="Calibri" w:cs="Calibri" w:eastAsia="Calibri" w:hAnsi="Calibri"/>
+          <w:sz w:val="24"/>
+          <w:szCs w:val="24"/>
+        </w:rPr>
+        <w:t/>
+      </w:r>
+      <w:r>
+        <w:rPr>
+          <w:rFonts w:ascii="Calibri" w:cs="Calibri" w:eastAsia="Calibri" w:hAnsi="Calibri"/>
+          <w:i/>
+          <w:iCs/>
+          <w:sz w:val="24"/>
+          <w:szCs w:val="24"/>
+        </w:rPr>
+        <w:t/>
+      </w:r>
+    </w:p>
+    <w:p>
+      <w:pPr>
+        <w:spacing w:after="120" w:line="276"/>
+      </w:pPr>
+      <w:r>
+        <w:rPr>
+          <w:rFonts w:ascii="Calibri" w:cs="Calibri" w:eastAsia="Calibri" w:hAnsi="Calibri"/>
+          <w:b/>
+          <w:bCs/>
+          <w:sz w:val="24"/>
+          <w:szCs w:val="24"/>
+        </w:rPr>
+        <w:t>(12). That one used a property instead of the difference. What is the difference of a triangle? → Three straight sides.</w:t>
+      </w:r>
+      <w:r>
+        <w:rPr>
+          <w:rFonts w:ascii="Calibri" w:cs="Calibri" w:eastAsia="Calibri" w:hAnsi="Calibri"/>
+          <w:sz w:val="24"/>
+          <w:szCs w:val="24"/>
+        </w:rPr>
+        <w:t/>
+      </w:r>
+      <w:r>
+        <w:rPr>
+          <w:rFonts w:ascii="Calibri" w:cs="Calibri" w:eastAsia="Calibri" w:hAnsi="Calibri"/>
+          <w:i/>
+          <w:iCs/>
+          <w:sz w:val="24"/>
+          <w:szCs w:val="24"/>
+        </w:rPr>
+        <w:t/>
       </w:r>
     </w:p>
     <w:p>
@@ -15749,7 +15679,7 @@
           <w:sz w:val="24"/>
           <w:szCs w:val="24"/>
         </w:rPr>
-        <w:t xml:space="preserve">PROPERTY — not what makes the thing what it is, but every one has it, always</w:t>
+        <w:t>PROPERTY — not what makes the thing what it is, but every one has it, always, and nothing else does</w:t>
       </w:r>
     </w:p>
     <w:p>
@@ -18399,17 +18329,7 @@
           <w:sz w:val="24"/>
           <w:szCs w:val="24"/>
         </w:rPr>
-        <w:t xml:space="preserve"> is what we are asking about. What does "tall" mean when I say the tree is tall?</w:t>
-      </w:r>
-      <w:r>
-        <w:rPr>
-          <w:rFonts w:ascii="Calibri" w:cs="Calibri" w:eastAsia="Calibri" w:hAnsi="Calibri"/>
-          <w:i/>
-          <w:iCs/>
-          <w:sz w:val="24"/>
-          <w:szCs w:val="24"/>
-        </w:rPr>
-        <w:t xml:space="preserve"> → </w:t>
+        <w:t xml:space="preserve"> is what we are asking about. What does "tall" mean when I say the tree is tall? → </w:t>
       </w:r>
       <w:r>
         <w:rPr>
@@ -18427,27 +18347,7 @@
           <w:sz w:val="24"/>
           <w:szCs w:val="24"/>
         </w:rPr>
-        <w:t xml:space="preserve"> </w:t>
-      </w:r>
-      <w:r>
-        <w:rPr>
-          <w:rFonts w:ascii="Calibri" w:cs="Calibri" w:eastAsia="Calibri" w:hAnsi="Calibri"/>
-          <w:i/>
-          <w:iCs/>
-          <w:sz w:val="24"/>
-          <w:szCs w:val="24"/>
-        </w:rPr>
-        <w:t xml:space="preserve">And when I say the man is tall?</w:t>
-      </w:r>
-      <w:r>
-        <w:rPr>
-          <w:rFonts w:ascii="Calibri" w:cs="Calibri" w:eastAsia="Calibri" w:hAnsi="Calibri"/>
-          <w:i/>
-          <w:iCs/>
-          <w:sz w:val="24"/>
-          <w:szCs w:val="24"/>
-        </w:rPr>
-        <w:t xml:space="preserve"> → </w:t>
+        <w:t xml:space="preserve"> And when I say the man is tall? → </w:t>
       </w:r>
       <w:r>
         <w:rPr>
@@ -18465,37 +18365,7 @@
           <w:sz w:val="24"/>
           <w:szCs w:val="24"/>
         </w:rPr>
-        <w:t xml:space="preserve"> </w:t>
-      </w:r>
-      <w:r>
-        <w:rPr>
-          <w:rFonts w:ascii="Calibri" w:cs="Calibri" w:eastAsia="Calibri" w:hAnsi="Calibri"/>
-          <w:i/>
-          <w:iCs/>
-          <w:sz w:val="24"/>
-          <w:szCs w:val="24"/>
-        </w:rPr>
-        <w:t xml:space="preserve">Same account. Univocal. The two things can be as different as you like; the question is whether the word means the same.</w:t>
-      </w:r>
-      <w:r>
-        <w:rPr>
-          <w:rFonts w:ascii="Calibri" w:cs="Calibri" w:eastAsia="Calibri" w:hAnsi="Calibri"/>
-          <w:i/>
-          <w:iCs/>
-          <w:sz w:val="24"/>
-          <w:szCs w:val="24"/>
-        </w:rPr>
-        <w:t xml:space="preserve"> Retest in step 4. </w:t>
-      </w:r>
-      <w:r>
-        <w:rPr>
-          <w:rFonts w:ascii="Calibri" w:cs="Calibri" w:eastAsia="Calibri" w:hAnsi="Calibri"/>
-          <w:i/>
-          <w:iCs/>
-          <w:sz w:val="24"/>
-          <w:szCs w:val="24"/>
-        </w:rPr>
-        <w:t xml:space="preserve">(This is the most likely error in the lesson.)</w:t>
+        <w:t xml:space="preserve"> Same account. Univocal. The two things can be as different as you like; the question is whether the word means the same. Retest in step 4. (This is the most likely error in the lesson.)</w:t>
       </w:r>
       <w:r>
         <w:rPr>
@@ -18870,27 +18740,7 @@
           <w:sz w:val="24"/>
           <w:szCs w:val="24"/>
         </w:rPr>
-        <w:t xml:space="preserve"> genus. Watch me climb. A chair is a seat. A seat is furniture. Furniture is a — what?</w:t>
-      </w:r>
-      <w:r>
-        <w:rPr>
-          <w:rFonts w:ascii="Calibri" w:cs="Calibri" w:eastAsia="Calibri" w:hAnsi="Calibri"/>
-          <w:i/>
-          <w:iCs/>
-          <w:sz w:val="24"/>
-          <w:szCs w:val="24"/>
-        </w:rPr>
-        <w:t xml:space="preserve"> (Let them try.) </w:t>
-      </w:r>
-      <w:r>
-        <w:rPr>
-          <w:rFonts w:ascii="Calibri" w:cs="Calibri" w:eastAsia="Calibri" w:hAnsi="Calibri"/>
-          <w:i/>
-          <w:iCs/>
-          <w:sz w:val="24"/>
-          <w:szCs w:val="24"/>
-        </w:rPr>
-        <w:t xml:space="preserve">A thing? A being?</w:t>
+        <w:t xml:space="preserve"> genus. Watch me climb. A chair is a seat. A seat is furniture. Furniture is a — what? (Let them try.) A thing? A being?</w:t>
       </w:r>
       <w:r>
         <w:rPr>
@@ -20676,25 +20526,25 @@
           <w:sz w:val="24"/>
           <w:szCs w:val="24"/>
         </w:rPr>
-        <w:t xml:space="preserve">Which predicable? A square has four corners.</w:t>
-      </w:r>
-      <w:r>
-        <w:rPr>
-          <w:rFonts w:ascii="Calibri" w:cs="Calibri" w:eastAsia="Calibri" w:hAnsi="Calibri"/>
-          <w:sz w:val="24"/>
-          <w:szCs w:val="24"/>
-        </w:rPr>
-        <w:t xml:space="preserve"> → </w:t>
-      </w:r>
-      <w:r>
-        <w:rPr>
-          <w:rFonts w:ascii="Calibri" w:cs="Calibri" w:eastAsia="Calibri" w:hAnsi="Calibri"/>
-          <w:i/>
-          <w:iCs/>
-          <w:sz w:val="24"/>
-          <w:szCs w:val="24"/>
-        </w:rPr>
-        <w:t xml:space="preserve">Property.</w:t>
+        <w:t>Which predicable? Socrates can learn to read. → Property.</w:t>
+      </w:r>
+      <w:r>
+        <w:rPr>
+          <w:rFonts w:ascii="Calibri" w:cs="Calibri" w:eastAsia="Calibri" w:hAnsi="Calibri"/>
+          <w:sz w:val="24"/>
+          <w:szCs w:val="24"/>
+        </w:rPr>
+        <w:t/>
+      </w:r>
+      <w:r>
+        <w:rPr>
+          <w:rFonts w:ascii="Calibri" w:cs="Calibri" w:eastAsia="Calibri" w:hAnsi="Calibri"/>
+          <w:i/>
+          <w:iCs/>
+          <w:sz w:val="24"/>
+          <w:szCs w:val="24"/>
+        </w:rPr>
+        <w:t/>
       </w:r>
     </w:p>
     <w:p>
@@ -22669,7 +22519,7 @@
           <w:sz w:val="24"/>
           <w:szCs w:val="24"/>
         </w:rPr>
-        <w:t xml:space="preserve">PROPERTY — not what makes the thing what it is, but every one has it, always</w:t>
+        <w:t>PROPERTY — not what makes the thing what it is, but every one has it, always, and nothing else does</w:t>
       </w:r>
     </w:p>
     <w:p>
@@ -25529,17 +25379,7 @@
           <w:sz w:val="24"/>
           <w:szCs w:val="24"/>
         </w:rPr>
-        <w:t xml:space="preserve"> stand on its own? Show me a white that is not the white of anything.</w:t>
-      </w:r>
-      <w:r>
-        <w:rPr>
-          <w:rFonts w:ascii="Calibri" w:cs="Calibri" w:eastAsia="Calibri" w:hAnsi="Calibri"/>
-          <w:i/>
-          <w:iCs/>
-          <w:sz w:val="24"/>
-          <w:szCs w:val="24"/>
-        </w:rPr>
-        <w:t xml:space="preserve"> → </w:t>
+        <w:t xml:space="preserve"> stand on its own? Show me a white that is not the white of anything. → </w:t>
       </w:r>
       <w:r>
         <w:rPr>
@@ -25557,37 +25397,7 @@
           <w:sz w:val="24"/>
           <w:szCs w:val="24"/>
         </w:rPr>
-        <w:t xml:space="preserve"> </w:t>
-      </w:r>
-      <w:r>
-        <w:rPr>
-          <w:rFonts w:ascii="Calibri" w:cs="Calibri" w:eastAsia="Calibri" w:hAnsi="Calibri"/>
-          <w:i/>
-          <w:iCs/>
-          <w:sz w:val="24"/>
-          <w:szCs w:val="24"/>
-        </w:rPr>
-        <w:t xml:space="preserve">Then it exists in another. Accident.</w:t>
-      </w:r>
-      <w:r>
-        <w:rPr>
-          <w:rFonts w:ascii="Calibri" w:cs="Calibri" w:eastAsia="Calibri" w:hAnsi="Calibri"/>
-          <w:i/>
-          <w:iCs/>
-          <w:sz w:val="24"/>
-          <w:szCs w:val="24"/>
-        </w:rPr>
-        <w:t xml:space="preserve"> Retest in step 4. </w:t>
-      </w:r>
-      <w:r>
-        <w:rPr>
-          <w:rFonts w:ascii="Calibri" w:cs="Calibri" w:eastAsia="Calibri" w:hAnsi="Calibri"/>
-          <w:i/>
-          <w:iCs/>
-          <w:sz w:val="24"/>
-          <w:szCs w:val="24"/>
-        </w:rPr>
-        <w:t xml:space="preserve">(This is the likeliest error: confusing a word standing alone with a thing standing alone.)</w:t>
+        <w:t xml:space="preserve"> Then it exists in another. Accident. Retest in step 4. (This is the likeliest error: confusing a word standing alone with a thing standing alone.)</w:t>
       </w:r>
       <w:r>
         <w:rPr>
@@ -28767,25 +28577,25 @@
           <w:sz w:val="24"/>
           <w:szCs w:val="24"/>
         </w:rPr>
-        <w:t xml:space="preserve">Which predicable? A knife can go dull.</w:t>
-      </w:r>
-      <w:r>
-        <w:rPr>
-          <w:rFonts w:ascii="Calibri" w:cs="Calibri" w:eastAsia="Calibri" w:hAnsi="Calibri"/>
-          <w:sz w:val="24"/>
-          <w:szCs w:val="24"/>
-        </w:rPr>
-        <w:t xml:space="preserve"> → </w:t>
-      </w:r>
-      <w:r>
-        <w:rPr>
-          <w:rFonts w:ascii="Calibri" w:cs="Calibri" w:eastAsia="Calibri" w:hAnsi="Calibri"/>
-          <w:i/>
-          <w:iCs/>
-          <w:sz w:val="24"/>
-          <w:szCs w:val="24"/>
-        </w:rPr>
-        <w:t xml:space="preserve">Property.</w:t>
+        <w:t>Which predicable? A triangle has three corners. → Property.</w:t>
+      </w:r>
+      <w:r>
+        <w:rPr>
+          <w:rFonts w:ascii="Calibri" w:cs="Calibri" w:eastAsia="Calibri" w:hAnsi="Calibri"/>
+          <w:sz w:val="24"/>
+          <w:szCs w:val="24"/>
+        </w:rPr>
+        <w:t/>
+      </w:r>
+      <w:r>
+        <w:rPr>
+          <w:rFonts w:ascii="Calibri" w:cs="Calibri" w:eastAsia="Calibri" w:hAnsi="Calibri"/>
+          <w:i/>
+          <w:iCs/>
+          <w:sz w:val="24"/>
+          <w:szCs w:val="24"/>
+        </w:rPr>
+        <w:t/>
       </w:r>
     </w:p>
     <w:p>
@@ -31155,7 +30965,7 @@
           <w:sz w:val="24"/>
           <w:szCs w:val="24"/>
         </w:rPr>
-        <w:t xml:space="preserve">PROPERTY — not what makes the thing what it is, but every one has it, always</w:t>
+        <w:t>PROPERTY — not what makes the thing what it is, but every one has it, always, and nothing else does</w:t>
       </w:r>
     </w:p>
     <w:p>

</xml_diff>